<commit_message>
Print the client's address in the cover-letter details box
The form collects a Client address but the cover-letter details box
(Date / Client Name / Contact / Position / Phone) never printed it. Add an
Address row after Client Name, wrapped in a conditional so it is omitted
when the field is blank. The same insertion is in the template build
script so a future rebuild keeps it.

Co-Authored-By: Claude Opus 5.5 <noreply@anthropic.com>
</commit_message>
<xml_diff>
--- a/template/proposal_template.docx
+++ b/template/proposal_template.docx
@@ -493,6 +493,41 @@
                 <w:szCs w:val="21"/>
               </w:rPr>
               <w:t xml:space="preserve">{{ client_name }}</w:t>
+            </w:r>
+          </w:p>
+          <w:p>
+            <w:r>
+              <w:t xml:space="preserve">{%p if client_address %}</w:t>
+            </w:r>
+          </w:p>
+          <w:p>
+            <w:pPr>
+              <w:spacing w:after="80" w:before="0"/>
+            </w:pPr>
+            <w:r>
+              <w:rPr>
+                <w:rFonts w:ascii="Calibri" w:cs="Calibri" w:eastAsia="Calibri" w:hAnsi="Calibri"/>
+                <w:b/>
+                <w:bCs/>
+                <w:color w:val="1F3A2E"/>
+                <w:sz w:val="21"/>
+                <w:szCs w:val="21"/>
+              </w:rPr>
+              <w:t xml:space="preserve">Address   </w:t>
+            </w:r>
+            <w:r>
+              <w:rPr>
+                <w:rFonts w:ascii="Calibri" w:cs="Calibri" w:eastAsia="Calibri" w:hAnsi="Calibri"/>
+                <w:color w:val="2B2B2B"/>
+                <w:sz w:val="21"/>
+                <w:szCs w:val="21"/>
+              </w:rPr>
+              <w:t xml:space="preserve">{{ client_address }}</w:t>
+            </w:r>
+          </w:p>
+          <w:p>
+            <w:r>
+              <w:t xml:space="preserve">{%p endif %}</w:t>
             </w:r>
           </w:p>
           <w:p>

</xml_diff>

<commit_message>
Placeholder guard, working Site/Reference fields, fail-closed password, pinned deps, PDF retry
- Generate now scans the produced document (body + headers) for unfilled
  [...] placeholders and shows 'Not ready to send' listing them instead of
  'Proposal ready'. The form opens pre-filled with [Client name], [Address]
  etc., and nothing stopped those reaching a client.
- 'Site / office' fills the cover letter's [your site] gap (and Client name
  fills [Client name]); 'Reference' is printed on the cover page beside the
  date. Both fields were collected but never used. Cover-reference insertion
  is also a step in the template build script.
- Password: no fallback to a known default. With no app_password secret the
  app shows a locked message; comparison is constant-time.
- requirements.txt pinned to the versions tested together.
- A failed Create PDF no longer hides the button; it says so and lets you retry.

Co-Authored-By: Claude Opus 5.5 <noreply@anthropic.com>
</commit_message>
<xml_diff>
--- a/template/proposal_template.docx
+++ b/template/proposal_template.docx
@@ -313,6 +313,36 @@
           <w:szCs w:val="19"/>
         </w:rPr>
         <w:t xml:space="preserve">{{ date }}</w:t>
+      </w:r>
+      <w:r>
+        <w:rPr>
+          <w:rFonts w:ascii="Calibri" w:cs="Calibri" w:eastAsia="Calibri" w:hAnsi="Calibri"/>
+          <w:color w:val="2B2B2B"/>
+          <w:sz w:val="19"/>
+          <w:szCs w:val="19"/>
+        </w:rPr>
+        <w:t xml:space="preserve">        </w:t>
+      </w:r>
+      <w:r>
+        <w:rPr>
+          <w:rFonts w:ascii="Calibri" w:cs="Calibri" w:eastAsia="Calibri" w:hAnsi="Calibri"/>
+          <w:b/>
+          <w:bCs/>
+          <w:color w:val="6B7280"/>
+          <w:spacing w:val="30"/>
+          <w:sz w:val="19"/>
+          <w:szCs w:val="19"/>
+        </w:rPr>
+        <w:t xml:space="preserve">Reference   </w:t>
+      </w:r>
+      <w:r>
+        <w:rPr>
+          <w:rFonts w:ascii="Calibri" w:cs="Calibri" w:eastAsia="Calibri" w:hAnsi="Calibri"/>
+          <w:color w:val="2B2B2B"/>
+          <w:sz w:val="19"/>
+          <w:szCs w:val="19"/>
+        </w:rPr>
+        <w:t xml:space="preserve">{{ reference }}</w:t>
       </w:r>
     </w:p>
     <w:p>

</xml_diff>